<commit_message>
feat: add pipeline diagrams and embed into Word project report
</commit_message>
<xml_diff>
--- a/Cloud_Complaint_Management_System_Micro_Project_Report.docx
+++ b/Cloud_Complaint_Management_System_Micro_Project_Report.docx
@@ -1208,6 +1208,114 @@
     </w:p>
     <w:p>
       <w:pPr>
+        <w:spacing w:before="160" w:after="80"/>
+        <w:jc w:val="center"/>
+      </w:pPr>
+      <w:r>
+        <w:drawing>
+          <wp:inline xmlns:a="http://schemas.openxmlformats.org/drawingml/2006/main" xmlns:pic="http://schemas.openxmlformats.org/drawingml/2006/picture">
+            <wp:extent cx="5669280" cy="3576593"/>
+            <wp:docPr id="1" name="Picture 1"/>
+            <wp:cNvGraphicFramePr>
+              <a:graphicFrameLocks noChangeAspect="1"/>
+            </wp:cNvGraphicFramePr>
+            <a:graphic>
+              <a:graphicData uri="http://schemas.openxmlformats.org/drawingml/2006/picture">
+                <pic:pic>
+                  <pic:nvPicPr>
+                    <pic:cNvPr id="0" name="cloud_storage_pipeline_diagram.png"/>
+                    <pic:cNvPicPr/>
+                  </pic:nvPicPr>
+                  <pic:blipFill>
+                    <a:blip r:embed="rId9"/>
+                    <a:stretch>
+                      <a:fillRect/>
+                    </a:stretch>
+                  </pic:blipFill>
+                  <pic:spPr>
+                    <a:xfrm>
+                      <a:off x="0" y="0"/>
+                      <a:ext cx="5669280" cy="3576593"/>
+                    </a:xfrm>
+                    <a:prstGeom prst="rect"/>
+                  </pic:spPr>
+                </pic:pic>
+              </a:graphicData>
+            </a:graphic>
+          </wp:inline>
+        </w:drawing>
+      </w:r>
+    </w:p>
+    <w:p>
+      <w:pPr>
+        <w:spacing w:after="160"/>
+        <w:jc w:val="center"/>
+      </w:pPr>
+      <w:r>
+        <w:rPr>
+          <w:rFonts w:ascii="Times New Roman" w:hAnsi="Times New Roman"/>
+          <w:b/>
+          <w:sz w:val="20"/>
+        </w:rPr>
+        <w:t>Figure 6.1: Decoupled Cloud Data Storage &amp; Ingestion Pipeline Architecture</w:t>
+      </w:r>
+    </w:p>
+    <w:p>
+      <w:pPr>
+        <w:spacing w:before="120" w:after="80"/>
+        <w:jc w:val="center"/>
+      </w:pPr>
+      <w:r>
+        <w:drawing>
+          <wp:inline xmlns:a="http://schemas.openxmlformats.org/drawingml/2006/main" xmlns:pic="http://schemas.openxmlformats.org/drawingml/2006/picture">
+            <wp:extent cx="5486400" cy="3062177"/>
+            <wp:docPr id="2" name="Picture 2"/>
+            <wp:cNvGraphicFramePr>
+              <a:graphicFrameLocks noChangeAspect="1"/>
+            </wp:cNvGraphicFramePr>
+            <a:graphic>
+              <a:graphicData uri="http://schemas.openxmlformats.org/drawingml/2006/picture">
+                <pic:pic>
+                  <pic:nvPicPr>
+                    <pic:cNvPr id="0" name="cloud_pipeline_3d_architecture.jpg"/>
+                    <pic:cNvPicPr/>
+                  </pic:nvPicPr>
+                  <pic:blipFill>
+                    <a:blip r:embed="rId10"/>
+                    <a:stretch>
+                      <a:fillRect/>
+                    </a:stretch>
+                  </pic:blipFill>
+                  <pic:spPr>
+                    <a:xfrm>
+                      <a:off x="0" y="0"/>
+                      <a:ext cx="5486400" cy="3062177"/>
+                    </a:xfrm>
+                    <a:prstGeom prst="rect"/>
+                  </pic:spPr>
+                </pic:pic>
+              </a:graphicData>
+            </a:graphic>
+          </wp:inline>
+        </w:drawing>
+      </w:r>
+    </w:p>
+    <w:p>
+      <w:pPr>
+        <w:spacing w:after="160"/>
+        <w:jc w:val="center"/>
+      </w:pPr>
+      <w:r>
+        <w:rPr>
+          <w:rFonts w:ascii="Times New Roman" w:hAnsi="Times New Roman"/>
+          <w:b/>
+          <w:sz w:val="20"/>
+        </w:rPr>
+        <w:t>Figure 6.2: 3D Isometric View of Dual-Stream Cloud Pipeline (Compute, DBaaS, Object CDN)</w:t>
+      </w:r>
+    </w:p>
+    <w:p>
+      <w:pPr>
         <w:spacing w:before="240" w:after="120"/>
         <w:jc w:val="left"/>
       </w:pPr>
@@ -1657,7 +1765,7 @@
         <w:drawing>
           <wp:inline xmlns:a="http://schemas.openxmlformats.org/drawingml/2006/main" xmlns:pic="http://schemas.openxmlformats.org/drawingml/2006/picture">
             <wp:extent cx="5303520" cy="3027550"/>
-            <wp:docPr id="1" name="Picture 1"/>
+            <wp:docPr id="3" name="Picture 3"/>
             <wp:cNvGraphicFramePr>
               <a:graphicFrameLocks noChangeAspect="1"/>
             </wp:cNvGraphicFramePr>
@@ -1669,7 +1777,7 @@
                     <pic:cNvPicPr/>
                   </pic:nvPicPr>
                   <pic:blipFill>
-                    <a:blip r:embed="rId9"/>
+                    <a:blip r:embed="rId11"/>
                     <a:stretch>
                       <a:fillRect/>
                     </a:stretch>
@@ -1724,7 +1832,7 @@
         <w:drawing>
           <wp:inline xmlns:a="http://schemas.openxmlformats.org/drawingml/2006/main" xmlns:pic="http://schemas.openxmlformats.org/drawingml/2006/picture">
             <wp:extent cx="5303520" cy="3027550"/>
-            <wp:docPr id="2" name="Picture 2"/>
+            <wp:docPr id="4" name="Picture 4"/>
             <wp:cNvGraphicFramePr>
               <a:graphicFrameLocks noChangeAspect="1"/>
             </wp:cNvGraphicFramePr>
@@ -1736,7 +1844,7 @@
                     <pic:cNvPicPr/>
                   </pic:nvPicPr>
                   <pic:blipFill>
-                    <a:blip r:embed="rId10"/>
+                    <a:blip r:embed="rId12"/>
                     <a:stretch>
                       <a:fillRect/>
                     </a:stretch>
@@ -1791,7 +1899,7 @@
         <w:drawing>
           <wp:inline xmlns:a="http://schemas.openxmlformats.org/drawingml/2006/main" xmlns:pic="http://schemas.openxmlformats.org/drawingml/2006/picture">
             <wp:extent cx="5303520" cy="3027550"/>
-            <wp:docPr id="3" name="Picture 3"/>
+            <wp:docPr id="5" name="Picture 5"/>
             <wp:cNvGraphicFramePr>
               <a:graphicFrameLocks noChangeAspect="1"/>
             </wp:cNvGraphicFramePr>
@@ -1803,7 +1911,7 @@
                     <pic:cNvPicPr/>
                   </pic:nvPicPr>
                   <pic:blipFill>
-                    <a:blip r:embed="rId11"/>
+                    <a:blip r:embed="rId13"/>
                     <a:stretch>
                       <a:fillRect/>
                     </a:stretch>

</xml_diff>